<commit_message>
Added more experiments (files alone)
</commit_message>
<xml_diff>
--- a/Exp_2.docx
+++ b/Exp_2.docx
@@ -30,6 +30,94 @@
           <w:szCs w:val="28"/>
         </w:rPr>
       </w:pPr>
+      <w:r>
+        <w:rPr>
+          <w:b/>
+          <w:bCs/>
+          <w:sz w:val="28"/>
+          <w:szCs w:val="28"/>
+        </w:rPr>
+        <w:t>Shell Script (1):</w:t>
+      </w:r>
+    </w:p>
+    <w:p>
+      <w:pPr>
+        <w:jc w:val="center"/>
+        <w:rPr>
+          <w:b/>
+          <w:bCs/>
+          <w:sz w:val="28"/>
+          <w:szCs w:val="28"/>
+        </w:rPr>
+      </w:pPr>
+      <w:r>
+        <w:rPr>
+          <w:noProof/>
+        </w:rPr>
+        <w:drawing>
+          <wp:inline distT="0" distB="0" distL="0" distR="0" wp14:anchorId="2E034E75" wp14:editId="28BC2118">
+            <wp:extent cx="3911331" cy="2857500"/>
+            <wp:effectExtent l="0" t="0" r="0" b="0"/>
+            <wp:docPr id="1110990388" name="Picture 1"/>
+            <wp:cNvGraphicFramePr>
+              <a:graphicFrameLocks xmlns:a="http://schemas.openxmlformats.org/drawingml/2006/main" noChangeAspect="1"/>
+            </wp:cNvGraphicFramePr>
+            <a:graphic xmlns:a="http://schemas.openxmlformats.org/drawingml/2006/main">
+              <a:graphicData uri="http://schemas.openxmlformats.org/drawingml/2006/picture">
+                <pic:pic xmlns:pic="http://schemas.openxmlformats.org/drawingml/2006/picture">
+                  <pic:nvPicPr>
+                    <pic:cNvPr id="1110990388" name=""/>
+                    <pic:cNvPicPr/>
+                  </pic:nvPicPr>
+                  <pic:blipFill rotWithShape="1">
+                    <a:blip r:embed="rId4"/>
+                    <a:srcRect b="4883"/>
+                    <a:stretch>
+                      <a:fillRect/>
+                    </a:stretch>
+                  </pic:blipFill>
+                  <pic:spPr bwMode="auto">
+                    <a:xfrm>
+                      <a:off x="0" y="0"/>
+                      <a:ext cx="3917359" cy="2861904"/>
+                    </a:xfrm>
+                    <a:prstGeom prst="rect">
+                      <a:avLst/>
+                    </a:prstGeom>
+                    <a:ln>
+                      <a:noFill/>
+                    </a:ln>
+                    <a:extLst>
+                      <a:ext uri="{53640926-AAD7-44D8-BBD7-CCE9431645EC}">
+                        <a14:shadowObscured xmlns:a14="http://schemas.microsoft.com/office/drawing/2010/main"/>
+                      </a:ext>
+                    </a:extLst>
+                  </pic:spPr>
+                </pic:pic>
+              </a:graphicData>
+            </a:graphic>
+          </wp:inline>
+        </w:drawing>
+      </w:r>
+    </w:p>
+    <w:p>
+      <w:pPr>
+        <w:rPr>
+          <w:b/>
+          <w:bCs/>
+          <w:sz w:val="28"/>
+          <w:szCs w:val="28"/>
+        </w:rPr>
+      </w:pPr>
+      <w:r>
+        <w:rPr>
+          <w:b/>
+          <w:bCs/>
+          <w:sz w:val="28"/>
+          <w:szCs w:val="28"/>
+        </w:rPr>
+        <w:t>Output (1):</w:t>
+      </w:r>
     </w:p>
     <w:p>
       <w:pPr>
@@ -55,7 +143,7 @@
                     <pic:cNvPicPr/>
                   </pic:nvPicPr>
                   <pic:blipFill>
-                    <a:blip r:embed="rId4"/>
+                    <a:blip r:embed="rId5"/>
                     <a:stretch>
                       <a:fillRect/>
                     </a:stretch>
@@ -83,12 +171,125 @@
     </w:p>
     <w:p>
       <w:pPr>
+        <w:rPr>
+          <w:b/>
+          <w:bCs/>
+          <w:sz w:val="28"/>
+          <w:szCs w:val="28"/>
+        </w:rPr>
+      </w:pPr>
+      <w:r>
+        <w:rPr>
+          <w:b/>
+          <w:bCs/>
+          <w:sz w:val="28"/>
+          <w:szCs w:val="28"/>
+        </w:rPr>
+        <w:t>Shell Script (</w:t>
+      </w:r>
+      <w:r>
+        <w:rPr>
+          <w:b/>
+          <w:bCs/>
+          <w:sz w:val="28"/>
+          <w:szCs w:val="28"/>
+        </w:rPr>
+        <w:t>2</w:t>
+      </w:r>
+      <w:r>
+        <w:rPr>
+          <w:b/>
+          <w:bCs/>
+          <w:sz w:val="28"/>
+          <w:szCs w:val="28"/>
+        </w:rPr>
+        <w:t>):</w:t>
+      </w:r>
+    </w:p>
+    <w:p>
+      <w:pPr>
         <w:jc w:val="center"/>
       </w:pPr>
       <w:r>
         <w:rPr>
           <w:noProof/>
         </w:rPr>
+        <w:drawing>
+          <wp:inline distT="0" distB="0" distL="0" distR="0" wp14:anchorId="65EA9000" wp14:editId="72A34602">
+            <wp:extent cx="4800600" cy="1905000"/>
+            <wp:effectExtent l="0" t="0" r="0" b="0"/>
+            <wp:docPr id="191252389" name="Picture 1"/>
+            <wp:cNvGraphicFramePr>
+              <a:graphicFrameLocks xmlns:a="http://schemas.openxmlformats.org/drawingml/2006/main" noChangeAspect="1"/>
+            </wp:cNvGraphicFramePr>
+            <a:graphic xmlns:a="http://schemas.openxmlformats.org/drawingml/2006/main">
+              <a:graphicData uri="http://schemas.openxmlformats.org/drawingml/2006/picture">
+                <pic:pic xmlns:pic="http://schemas.openxmlformats.org/drawingml/2006/picture">
+                  <pic:nvPicPr>
+                    <pic:cNvPr id="191252389" name=""/>
+                    <pic:cNvPicPr/>
+                  </pic:nvPicPr>
+                  <pic:blipFill>
+                    <a:blip r:embed="rId6"/>
+                    <a:stretch>
+                      <a:fillRect/>
+                    </a:stretch>
+                  </pic:blipFill>
+                  <pic:spPr>
+                    <a:xfrm>
+                      <a:off x="0" y="0"/>
+                      <a:ext cx="4800600" cy="1905000"/>
+                    </a:xfrm>
+                    <a:prstGeom prst="rect">
+                      <a:avLst/>
+                    </a:prstGeom>
+                  </pic:spPr>
+                </pic:pic>
+              </a:graphicData>
+            </a:graphic>
+          </wp:inline>
+        </w:drawing>
+      </w:r>
+    </w:p>
+    <w:p>
+      <w:pPr>
+        <w:jc w:val="center"/>
+      </w:pPr>
+    </w:p>
+    <w:p>
+      <w:pPr>
+        <w:jc w:val="center"/>
+      </w:pPr>
+    </w:p>
+    <w:p>
+      <w:pPr>
+        <w:jc w:val="center"/>
+      </w:pPr>
+    </w:p>
+    <w:p>
+      <w:pPr>
+        <w:rPr>
+          <w:b/>
+          <w:bCs/>
+        </w:rPr>
+      </w:pPr>
+      <w:r>
+        <w:rPr>
+          <w:b/>
+          <w:bCs/>
+        </w:rPr>
+        <w:t>Output (2):</w:t>
+      </w:r>
+    </w:p>
+    <w:p>
+      <w:pPr>
+        <w:jc w:val="center"/>
+      </w:pPr>
+      <w:r>
+        <w:rPr>
+          <w:noProof/>
+        </w:rPr>
+        <w:lastRenderedPageBreak/>
         <w:drawing>
           <wp:inline distT="0" distB="0" distL="0" distR="0" wp14:anchorId="2F454DD7" wp14:editId="58B02339">
             <wp:extent cx="5249531" cy="956310"/>
@@ -105,7 +306,7 @@
                     <pic:cNvPicPr/>
                   </pic:nvPicPr>
                   <pic:blipFill>
-                    <a:blip r:embed="rId5"/>
+                    <a:blip r:embed="rId7"/>
                     <a:stretch>
                       <a:fillRect/>
                     </a:stretch>
@@ -126,10 +327,92 @@
         </w:drawing>
       </w:r>
     </w:p>
+    <w:p/>
+    <w:p>
+      <w:pPr>
+        <w:rPr>
+          <w:b/>
+          <w:bCs/>
+        </w:rPr>
+      </w:pPr>
+      <w:r>
+        <w:rPr>
+          <w:b/>
+          <w:bCs/>
+        </w:rPr>
+        <w:t>Shell Script (3):</w:t>
+      </w:r>
+    </w:p>
     <w:p>
       <w:pPr>
         <w:jc w:val="center"/>
-      </w:pPr>
+        <w:rPr>
+          <w:b/>
+          <w:bCs/>
+        </w:rPr>
+      </w:pPr>
+      <w:r>
+        <w:rPr>
+          <w:b/>
+          <w:bCs/>
+        </w:rPr>
+        <w:tab/>
+      </w:r>
+      <w:r>
+        <w:rPr>
+          <w:noProof/>
+        </w:rPr>
+        <w:drawing>
+          <wp:inline distT="0" distB="0" distL="0" distR="0" wp14:anchorId="5BE91F6C" wp14:editId="3BF1AE50">
+            <wp:extent cx="3835400" cy="2546190"/>
+            <wp:effectExtent l="0" t="0" r="0" b="6985"/>
+            <wp:docPr id="1789935958" name="Picture 1"/>
+            <wp:cNvGraphicFramePr>
+              <a:graphicFrameLocks xmlns:a="http://schemas.openxmlformats.org/drawingml/2006/main" noChangeAspect="1"/>
+            </wp:cNvGraphicFramePr>
+            <a:graphic xmlns:a="http://schemas.openxmlformats.org/drawingml/2006/main">
+              <a:graphicData uri="http://schemas.openxmlformats.org/drawingml/2006/picture">
+                <pic:pic xmlns:pic="http://schemas.openxmlformats.org/drawingml/2006/picture">
+                  <pic:nvPicPr>
+                    <pic:cNvPr id="1789935958" name=""/>
+                    <pic:cNvPicPr/>
+                  </pic:nvPicPr>
+                  <pic:blipFill>
+                    <a:blip r:embed="rId8"/>
+                    <a:stretch>
+                      <a:fillRect/>
+                    </a:stretch>
+                  </pic:blipFill>
+                  <pic:spPr>
+                    <a:xfrm>
+                      <a:off x="0" y="0"/>
+                      <a:ext cx="3842555" cy="2550940"/>
+                    </a:xfrm>
+                    <a:prstGeom prst="rect">
+                      <a:avLst/>
+                    </a:prstGeom>
+                  </pic:spPr>
+                </pic:pic>
+              </a:graphicData>
+            </a:graphic>
+          </wp:inline>
+        </w:drawing>
+      </w:r>
+    </w:p>
+    <w:p>
+      <w:pPr>
+        <w:rPr>
+          <w:b/>
+          <w:bCs/>
+        </w:rPr>
+      </w:pPr>
+      <w:r>
+        <w:rPr>
+          <w:b/>
+          <w:bCs/>
+        </w:rPr>
+        <w:t>Output (3):</w:t>
+      </w:r>
     </w:p>
     <w:p>
       <w:pPr>
@@ -155,7 +438,7 @@
                     <pic:cNvPicPr/>
                   </pic:nvPicPr>
                   <pic:blipFill>
-                    <a:blip r:embed="rId6"/>
+                    <a:blip r:embed="rId9"/>
                     <a:stretch>
                       <a:fillRect/>
                     </a:stretch>
@@ -183,6 +466,94 @@
     </w:p>
     <w:p>
       <w:pPr>
+        <w:rPr>
+          <w:b/>
+          <w:bCs/>
+        </w:rPr>
+      </w:pPr>
+      <w:r>
+        <w:rPr>
+          <w:b/>
+          <w:bCs/>
+        </w:rPr>
+        <w:t>Shell Script (4):</w:t>
+      </w:r>
+    </w:p>
+    <w:p>
+      <w:pPr>
+        <w:jc w:val="center"/>
+        <w:rPr>
+          <w:b/>
+          <w:bCs/>
+        </w:rPr>
+      </w:pPr>
+      <w:r>
+        <w:rPr>
+          <w:noProof/>
+        </w:rPr>
+        <w:drawing>
+          <wp:inline distT="0" distB="0" distL="0" distR="0" wp14:anchorId="0DD02561" wp14:editId="0536A853">
+            <wp:extent cx="3486150" cy="2714625"/>
+            <wp:effectExtent l="0" t="0" r="0" b="9525"/>
+            <wp:docPr id="973379028" name="Picture 1"/>
+            <wp:cNvGraphicFramePr>
+              <a:graphicFrameLocks xmlns:a="http://schemas.openxmlformats.org/drawingml/2006/main" noChangeAspect="1"/>
+            </wp:cNvGraphicFramePr>
+            <a:graphic xmlns:a="http://schemas.openxmlformats.org/drawingml/2006/main">
+              <a:graphicData uri="http://schemas.openxmlformats.org/drawingml/2006/picture">
+                <pic:pic xmlns:pic="http://schemas.openxmlformats.org/drawingml/2006/picture">
+                  <pic:nvPicPr>
+                    <pic:cNvPr id="973379028" name=""/>
+                    <pic:cNvPicPr/>
+                  </pic:nvPicPr>
+                  <pic:blipFill>
+                    <a:blip r:embed="rId10"/>
+                    <a:stretch>
+                      <a:fillRect/>
+                    </a:stretch>
+                  </pic:blipFill>
+                  <pic:spPr>
+                    <a:xfrm>
+                      <a:off x="0" y="0"/>
+                      <a:ext cx="3486150" cy="2714625"/>
+                    </a:xfrm>
+                    <a:prstGeom prst="rect">
+                      <a:avLst/>
+                    </a:prstGeom>
+                  </pic:spPr>
+                </pic:pic>
+              </a:graphicData>
+            </a:graphic>
+          </wp:inline>
+        </w:drawing>
+      </w:r>
+    </w:p>
+    <w:p>
+      <w:pPr>
+        <w:jc w:val="center"/>
+        <w:rPr>
+          <w:b/>
+          <w:bCs/>
+        </w:rPr>
+      </w:pPr>
+    </w:p>
+    <w:p>
+      <w:pPr>
+        <w:rPr>
+          <w:b/>
+          <w:bCs/>
+        </w:rPr>
+      </w:pPr>
+      <w:r>
+        <w:rPr>
+          <w:b/>
+          <w:bCs/>
+        </w:rPr>
+        <w:t>Output (4):</w:t>
+      </w:r>
+    </w:p>
+    <w:p>
+      <w:pPr>
         <w:jc w:val="center"/>
       </w:pPr>
       <w:r>
@@ -205,7 +576,7 @@
                     <pic:cNvPicPr/>
                   </pic:nvPicPr>
                   <pic:blipFill>
-                    <a:blip r:embed="rId7"/>
+                    <a:blip r:embed="rId11"/>
                     <a:stretch>
                       <a:fillRect/>
                     </a:stretch>
@@ -226,10 +597,85 @@
         </w:drawing>
       </w:r>
     </w:p>
+    <w:p/>
+    <w:p>
+      <w:pPr>
+        <w:rPr>
+          <w:b/>
+          <w:bCs/>
+        </w:rPr>
+      </w:pPr>
+      <w:r>
+        <w:rPr>
+          <w:b/>
+          <w:bCs/>
+        </w:rPr>
+        <w:t>Shell Script (5):</w:t>
+      </w:r>
+    </w:p>
     <w:p>
       <w:pPr>
         <w:jc w:val="center"/>
-      </w:pPr>
+        <w:rPr>
+          <w:b/>
+          <w:bCs/>
+        </w:rPr>
+      </w:pPr>
+      <w:r>
+        <w:rPr>
+          <w:noProof/>
+        </w:rPr>
+        <w:drawing>
+          <wp:inline distT="0" distB="0" distL="0" distR="0" wp14:anchorId="66C4C2DF" wp14:editId="2574DFBF">
+            <wp:extent cx="4171950" cy="3190875"/>
+            <wp:effectExtent l="0" t="0" r="0" b="9525"/>
+            <wp:docPr id="1969202463" name="Picture 1"/>
+            <wp:cNvGraphicFramePr>
+              <a:graphicFrameLocks xmlns:a="http://schemas.openxmlformats.org/drawingml/2006/main" noChangeAspect="1"/>
+            </wp:cNvGraphicFramePr>
+            <a:graphic xmlns:a="http://schemas.openxmlformats.org/drawingml/2006/main">
+              <a:graphicData uri="http://schemas.openxmlformats.org/drawingml/2006/picture">
+                <pic:pic xmlns:pic="http://schemas.openxmlformats.org/drawingml/2006/picture">
+                  <pic:nvPicPr>
+                    <pic:cNvPr id="1969202463" name=""/>
+                    <pic:cNvPicPr/>
+                  </pic:nvPicPr>
+                  <pic:blipFill>
+                    <a:blip r:embed="rId12"/>
+                    <a:stretch>
+                      <a:fillRect/>
+                    </a:stretch>
+                  </pic:blipFill>
+                  <pic:spPr>
+                    <a:xfrm>
+                      <a:off x="0" y="0"/>
+                      <a:ext cx="4171950" cy="3190875"/>
+                    </a:xfrm>
+                    <a:prstGeom prst="rect">
+                      <a:avLst/>
+                    </a:prstGeom>
+                  </pic:spPr>
+                </pic:pic>
+              </a:graphicData>
+            </a:graphic>
+          </wp:inline>
+        </w:drawing>
+      </w:r>
+    </w:p>
+    <w:p>
+      <w:pPr>
+        <w:rPr>
+          <w:b/>
+          <w:bCs/>
+        </w:rPr>
+      </w:pPr>
+      <w:r>
+        <w:rPr>
+          <w:b/>
+          <w:bCs/>
+        </w:rPr>
+        <w:t>Output (5):</w:t>
+      </w:r>
     </w:p>
     <w:p>
       <w:pPr>
@@ -255,7 +701,7 @@
                     <pic:cNvPicPr/>
                   </pic:nvPicPr>
                   <pic:blipFill>
-                    <a:blip r:embed="rId8"/>
+                    <a:blip r:embed="rId13"/>
                     <a:stretch>
                       <a:fillRect/>
                     </a:stretch>
@@ -276,15 +722,95 @@
         </w:drawing>
       </w:r>
     </w:p>
+    <w:p/>
+    <w:p/>
+    <w:p/>
+    <w:p>
+      <w:pPr>
+        <w:rPr>
+          <w:b/>
+          <w:bCs/>
+        </w:rPr>
+      </w:pPr>
+    </w:p>
+    <w:p>
+      <w:pPr>
+        <w:rPr>
+          <w:b/>
+          <w:bCs/>
+        </w:rPr>
+      </w:pPr>
+      <w:r>
+        <w:rPr>
+          <w:b/>
+          <w:bCs/>
+        </w:rPr>
+        <w:t>Shell Script (6):</w:t>
+      </w:r>
+    </w:p>
     <w:p>
       <w:pPr>
         <w:jc w:val="center"/>
-      </w:pPr>
-    </w:p>
-    <w:p>
-      <w:pPr>
-        <w:jc w:val="center"/>
-      </w:pPr>
+        <w:rPr>
+          <w:b/>
+          <w:bCs/>
+        </w:rPr>
+      </w:pPr>
+      <w:r>
+        <w:rPr>
+          <w:noProof/>
+        </w:rPr>
+        <w:drawing>
+          <wp:inline distT="0" distB="0" distL="0" distR="0" wp14:anchorId="46661994" wp14:editId="6E03513C">
+            <wp:extent cx="4057650" cy="3600450"/>
+            <wp:effectExtent l="0" t="0" r="0" b="0"/>
+            <wp:docPr id="456847511" name="Picture 1"/>
+            <wp:cNvGraphicFramePr>
+              <a:graphicFrameLocks xmlns:a="http://schemas.openxmlformats.org/drawingml/2006/main" noChangeAspect="1"/>
+            </wp:cNvGraphicFramePr>
+            <a:graphic xmlns:a="http://schemas.openxmlformats.org/drawingml/2006/main">
+              <a:graphicData uri="http://schemas.openxmlformats.org/drawingml/2006/picture">
+                <pic:pic xmlns:pic="http://schemas.openxmlformats.org/drawingml/2006/picture">
+                  <pic:nvPicPr>
+                    <pic:cNvPr id="456847511" name=""/>
+                    <pic:cNvPicPr/>
+                  </pic:nvPicPr>
+                  <pic:blipFill>
+                    <a:blip r:embed="rId14"/>
+                    <a:stretch>
+                      <a:fillRect/>
+                    </a:stretch>
+                  </pic:blipFill>
+                  <pic:spPr>
+                    <a:xfrm>
+                      <a:off x="0" y="0"/>
+                      <a:ext cx="4057650" cy="3600450"/>
+                    </a:xfrm>
+                    <a:prstGeom prst="rect">
+                      <a:avLst/>
+                    </a:prstGeom>
+                  </pic:spPr>
+                </pic:pic>
+              </a:graphicData>
+            </a:graphic>
+          </wp:inline>
+        </w:drawing>
+      </w:r>
+    </w:p>
+    <w:p>
+      <w:pPr>
+        <w:rPr>
+          <w:b/>
+          <w:bCs/>
+        </w:rPr>
+      </w:pPr>
+      <w:r>
+        <w:rPr>
+          <w:b/>
+          <w:bCs/>
+        </w:rPr>
+        <w:t>Output (6):</w:t>
+      </w:r>
     </w:p>
     <w:p>
       <w:pPr>
@@ -310,7 +836,7 @@
                     <pic:cNvPicPr/>
                   </pic:nvPicPr>
                   <pic:blipFill>
-                    <a:blip r:embed="rId9"/>
+                    <a:blip r:embed="rId15"/>
                     <a:stretch>
                       <a:fillRect/>
                     </a:stretch>
@@ -331,10 +857,145 @@
         </w:drawing>
       </w:r>
     </w:p>
+    <w:p/>
+    <w:p>
+      <w:pPr>
+        <w:rPr>
+          <w:b/>
+          <w:bCs/>
+        </w:rPr>
+      </w:pPr>
+    </w:p>
+    <w:p>
+      <w:pPr>
+        <w:rPr>
+          <w:b/>
+          <w:bCs/>
+        </w:rPr>
+      </w:pPr>
+    </w:p>
+    <w:p>
+      <w:pPr>
+        <w:rPr>
+          <w:b/>
+          <w:bCs/>
+        </w:rPr>
+      </w:pPr>
+    </w:p>
+    <w:p>
+      <w:pPr>
+        <w:rPr>
+          <w:b/>
+          <w:bCs/>
+        </w:rPr>
+      </w:pPr>
+    </w:p>
+    <w:p>
+      <w:pPr>
+        <w:rPr>
+          <w:b/>
+          <w:bCs/>
+        </w:rPr>
+      </w:pPr>
+    </w:p>
+    <w:p>
+      <w:pPr>
+        <w:rPr>
+          <w:b/>
+          <w:bCs/>
+        </w:rPr>
+      </w:pPr>
+    </w:p>
+    <w:p>
+      <w:pPr>
+        <w:rPr>
+          <w:b/>
+          <w:bCs/>
+        </w:rPr>
+      </w:pPr>
+    </w:p>
+    <w:p>
+      <w:pPr>
+        <w:rPr>
+          <w:b/>
+          <w:bCs/>
+        </w:rPr>
+      </w:pPr>
+      <w:r>
+        <w:rPr>
+          <w:b/>
+          <w:bCs/>
+        </w:rPr>
+        <w:lastRenderedPageBreak/>
+        <w:t>Shell Script (7):</w:t>
+      </w:r>
+    </w:p>
     <w:p>
       <w:pPr>
         <w:jc w:val="center"/>
       </w:pPr>
+      <w:r>
+        <w:rPr>
+          <w:noProof/>
+        </w:rPr>
+        <w:drawing>
+          <wp:inline distT="0" distB="0" distL="0" distR="0" wp14:anchorId="6D8ED879" wp14:editId="35C8FEFE">
+            <wp:extent cx="4343400" cy="3430779"/>
+            <wp:effectExtent l="0" t="0" r="0" b="0"/>
+            <wp:docPr id="2019146627" name="Picture 1"/>
+            <wp:cNvGraphicFramePr>
+              <a:graphicFrameLocks xmlns:a="http://schemas.openxmlformats.org/drawingml/2006/main" noChangeAspect="1"/>
+            </wp:cNvGraphicFramePr>
+            <a:graphic xmlns:a="http://schemas.openxmlformats.org/drawingml/2006/main">
+              <a:graphicData uri="http://schemas.openxmlformats.org/drawingml/2006/picture">
+                <pic:pic xmlns:pic="http://schemas.openxmlformats.org/drawingml/2006/picture">
+                  <pic:nvPicPr>
+                    <pic:cNvPr id="2019146627" name=""/>
+                    <pic:cNvPicPr/>
+                  </pic:nvPicPr>
+                  <pic:blipFill>
+                    <a:blip r:embed="rId16"/>
+                    <a:stretch>
+                      <a:fillRect/>
+                    </a:stretch>
+                  </pic:blipFill>
+                  <pic:spPr>
+                    <a:xfrm>
+                      <a:off x="0" y="0"/>
+                      <a:ext cx="4360809" cy="3444530"/>
+                    </a:xfrm>
+                    <a:prstGeom prst="rect">
+                      <a:avLst/>
+                    </a:prstGeom>
+                  </pic:spPr>
+                </pic:pic>
+              </a:graphicData>
+            </a:graphic>
+          </wp:inline>
+        </w:drawing>
+      </w:r>
+    </w:p>
+    <w:p>
+      <w:pPr>
+        <w:rPr>
+          <w:b/>
+          <w:bCs/>
+        </w:rPr>
+      </w:pPr>
+      <w:r>
+        <w:rPr>
+          <w:b/>
+          <w:bCs/>
+        </w:rPr>
+        <w:t>Out</w:t>
+      </w:r>
+      <w:r>
+        <w:rPr>
+          <w:b/>
+          <w:bCs/>
+        </w:rPr>
+        <w:t>put (7):</w:t>
+      </w:r>
     </w:p>
     <w:p>
       <w:pPr>
@@ -360,7 +1021,7 @@
                     <pic:cNvPicPr/>
                   </pic:nvPicPr>
                   <pic:blipFill>
-                    <a:blip r:embed="rId10"/>
+                    <a:blip r:embed="rId17"/>
                     <a:stretch>
                       <a:fillRect/>
                     </a:stretch>
@@ -383,8 +1044,82 @@
     </w:p>
     <w:p>
       <w:pPr>
+        <w:rPr>
+          <w:b/>
+          <w:bCs/>
+        </w:rPr>
+      </w:pPr>
+      <w:r>
+        <w:rPr>
+          <w:b/>
+          <w:bCs/>
+        </w:rPr>
+        <w:t>Shell Script (8):</w:t>
+      </w:r>
+    </w:p>
+    <w:p>
+      <w:pPr>
         <w:jc w:val="center"/>
-      </w:pPr>
+        <w:rPr>
+          <w:b/>
+          <w:bCs/>
+        </w:rPr>
+      </w:pPr>
+      <w:r>
+        <w:rPr>
+          <w:noProof/>
+        </w:rPr>
+        <w:drawing>
+          <wp:inline distT="0" distB="0" distL="0" distR="0" wp14:anchorId="60442012" wp14:editId="308F38D1">
+            <wp:extent cx="3981450" cy="2333625"/>
+            <wp:effectExtent l="0" t="0" r="0" b="9525"/>
+            <wp:docPr id="895135778" name="Picture 1"/>
+            <wp:cNvGraphicFramePr>
+              <a:graphicFrameLocks xmlns:a="http://schemas.openxmlformats.org/drawingml/2006/main" noChangeAspect="1"/>
+            </wp:cNvGraphicFramePr>
+            <a:graphic xmlns:a="http://schemas.openxmlformats.org/drawingml/2006/main">
+              <a:graphicData uri="http://schemas.openxmlformats.org/drawingml/2006/picture">
+                <pic:pic xmlns:pic="http://schemas.openxmlformats.org/drawingml/2006/picture">
+                  <pic:nvPicPr>
+                    <pic:cNvPr id="895135778" name=""/>
+                    <pic:cNvPicPr/>
+                  </pic:nvPicPr>
+                  <pic:blipFill>
+                    <a:blip r:embed="rId18"/>
+                    <a:stretch>
+                      <a:fillRect/>
+                    </a:stretch>
+                  </pic:blipFill>
+                  <pic:spPr>
+                    <a:xfrm>
+                      <a:off x="0" y="0"/>
+                      <a:ext cx="3981450" cy="2333625"/>
+                    </a:xfrm>
+                    <a:prstGeom prst="rect">
+                      <a:avLst/>
+                    </a:prstGeom>
+                  </pic:spPr>
+                </pic:pic>
+              </a:graphicData>
+            </a:graphic>
+          </wp:inline>
+        </w:drawing>
+      </w:r>
+    </w:p>
+    <w:p>
+      <w:pPr>
+        <w:rPr>
+          <w:b/>
+          <w:bCs/>
+        </w:rPr>
+      </w:pPr>
+      <w:r>
+        <w:rPr>
+          <w:b/>
+          <w:bCs/>
+        </w:rPr>
+        <w:t>Output (8):</w:t>
+      </w:r>
     </w:p>
     <w:p>
       <w:pPr>
@@ -410,7 +1145,7 @@
                     <pic:cNvPicPr/>
                   </pic:nvPicPr>
                   <pic:blipFill>
-                    <a:blip r:embed="rId11"/>
+                    <a:blip r:embed="rId19"/>
                     <a:stretch>
                       <a:fillRect/>
                     </a:stretch>
@@ -433,7 +1168,7 @@
     </w:p>
     <w:sectPr>
       <w:pgSz w:w="11906" w:h="16838"/>
-      <w:pgMar w:top="1135" w:right="1440" w:bottom="1418" w:left="1440" w:header="708" w:footer="708" w:gutter="0"/>
+      <w:pgMar w:top="1135" w:right="1440" w:bottom="993" w:left="1440" w:header="708" w:footer="708" w:gutter="0"/>
       <w:cols w:space="708"/>
       <w:docGrid w:linePitch="360"/>
     </w:sectPr>
@@ -841,6 +1576,7 @@
   <w:style w:type="paragraph" w:default="1" w:styleId="Normal">
     <w:name w:val="Normal"/>
     <w:qFormat/>
+    <w:rsid w:val="00781B2D"/>
   </w:style>
   <w:style w:type="paragraph" w:styleId="Heading1">
     <w:name w:val="heading 1"/>

</xml_diff>